<commit_message>
more work on final report.  Almost done
</commit_message>
<xml_diff>
--- a/SOC Detection Engineering & Alert Design.docx
+++ b/SOC Detection Engineering & Alert Design.docx
@@ -194,70 +194,64 @@
       <w:pPr>
         <w:jc w:val="left"/>
         <w:rPr>
-          <w:sz w:val="36"/>
-          <w:szCs w:val="36"/>
-        </w:rPr>
-      </w:pPr>
-      <w:r>
-        <w:rPr>
-          <w:sz w:val="36"/>
-          <w:szCs w:val="36"/>
-          <w:rtl w:val="0"/>
-        </w:rPr>
-        <w:t xml:space="preserve">Attack Breakdown:</w:t>
-      </w:r>
-    </w:p>
-    <w:p>
-      <w:pPr>
-        <w:rPr>
           <w:sz w:val="40"/>
           <w:szCs w:val="40"/>
         </w:rPr>
       </w:pPr>
       <w:r>
         <w:rPr>
-          <w:rtl w:val="0"/>
-        </w:rPr>
-      </w:r>
-    </w:p>
-    <w:p>
-      <w:pPr>
-        <w:rPr>
-          <w:sz w:val="24"/>
-          <w:szCs w:val="24"/>
-        </w:rPr>
-      </w:pPr>
-      <w:r>
-        <w:rPr>
-          <w:sz w:val="24"/>
-          <w:szCs w:val="24"/>
-          <w:rtl w:val="0"/>
-        </w:rPr>
-        <w:t xml:space="preserve">How it occurred:</w:t>
-      </w:r>
-    </w:p>
-    <w:p>
-      <w:pPr>
-        <w:rPr>
-          <w:sz w:val="24"/>
-          <w:szCs w:val="24"/>
-        </w:rPr>
-      </w:pPr>
-      <w:r>
-        <w:rPr>
-          <w:rtl w:val="0"/>
-        </w:rPr>
-      </w:r>
-    </w:p>
-    <w:p>
-      <w:pPr>
-        <w:rPr/>
-      </w:pPr>
-      <w:r>
-        <w:rPr>
-          <w:rtl w:val="0"/>
-        </w:rPr>
-        <w:t xml:space="preserve">On 8/3/26, Michael Ascot, received several emails regarding invoices which appear to be legitimate. This sets the stage for the attack</w:t>
+          <w:sz w:val="40"/>
+          <w:szCs w:val="40"/>
+          <w:rtl w:val="0"/>
+        </w:rPr>
+        <w:t xml:space="preserve">Attack Breakdown:</w:t>
+      </w:r>
+    </w:p>
+    <w:p>
+      <w:pPr>
+        <w:rPr>
+          <w:sz w:val="40"/>
+          <w:szCs w:val="40"/>
+        </w:rPr>
+      </w:pPr>
+      <w:r>
+        <w:rPr>
+          <w:rtl w:val="0"/>
+        </w:rPr>
+      </w:r>
+    </w:p>
+    <w:p>
+      <w:pPr>
+        <w:rPr>
+          <w:sz w:val="24"/>
+          <w:szCs w:val="24"/>
+        </w:rPr>
+      </w:pPr>
+      <w:r>
+        <w:rPr>
+          <w:sz w:val="28"/>
+          <w:szCs w:val="28"/>
+          <w:rtl w:val="0"/>
+        </w:rPr>
+        <w:t xml:space="preserve">How it occurred</w:t>
+      </w:r>
+      <w:r>
+        <w:rPr>
+          <w:sz w:val="24"/>
+          <w:szCs w:val="24"/>
+          <w:rtl w:val="0"/>
+        </w:rPr>
+        <w:t xml:space="preserve">:</w:t>
+      </w:r>
+    </w:p>
+    <w:p>
+      <w:pPr>
+        <w:rPr/>
+      </w:pPr>
+      <w:r>
+        <w:rPr>
+          <w:rtl w:val="0"/>
+        </w:rPr>
       </w:r>
     </w:p>
     <w:p>
@@ -290,7 +284,23 @@
         <w:rPr>
           <w:rtl w:val="0"/>
         </w:rPr>
-        <w:t xml:space="preserve"> arrived with the attached file, </w:t>
+        <w:t xml:space="preserve"> was sent to </w:t>
+      </w:r>
+      <w:hyperlink r:id="rId6">
+        <w:r>
+          <w:rPr>
+            <w:color w:val="1155cc"/>
+            <w:u w:val="single"/>
+            <w:rtl w:val="0"/>
+          </w:rPr>
+          <w:t xml:space="preserve">michael.ascot@tryhatme.com</w:t>
+        </w:r>
+      </w:hyperlink>
+      <w:r>
+        <w:rPr>
+          <w:rtl w:val="0"/>
+        </w:rPr>
+        <w:t xml:space="preserve">  with an seemingly urgent subject line and body with an attached file, </w:t>
       </w:r>
       <w:r>
         <w:rPr>
@@ -298,13 +308,13 @@
           <w:iCs w:val="1"/>
           <w:rtl w:val="0"/>
         </w:rPr>
-        <w:t xml:space="preserve">ImportantInvoiceFerary.zip.</w:t>
-      </w:r>
-      <w:r>
-        <w:rPr>
-          <w:rtl w:val="0"/>
-        </w:rPr>
-        <w:t xml:space="preserve"> Notice that February is misspelled, which is the first sign that this is not be a legitimate email. </w:t>
+        <w:t xml:space="preserve">ImportantInvoice-Febrary.zip.</w:t>
+      </w:r>
+      <w:r>
+        <w:rPr>
+          <w:rtl w:val="0"/>
+        </w:rPr>
+        <w:t xml:space="preserve"> </w:t>
       </w:r>
     </w:p>
     <w:p>
@@ -330,16 +340,16 @@
           <wp:inline distB="114300" distT="114300" distL="114300" distR="114300">
             <wp:extent cx="5943600" cy="863600"/>
             <wp:effectExtent b="0" l="0" r="0" t="0"/>
-            <wp:docPr id="1" name="image2.png"/>
+            <wp:docPr id="1" name="image1.png"/>
             <a:graphic>
               <a:graphicData uri="http://schemas.openxmlformats.org/drawingml/2006/picture">
                 <pic:pic>
                   <pic:nvPicPr>
-                    <pic:cNvPr id="0" name="image2.png"/>
+                    <pic:cNvPr id="0" name="image1.png"/>
                     <pic:cNvPicPr preferRelativeResize="0"/>
                   </pic:nvPicPr>
                   <pic:blipFill>
-                    <a:blip r:embed="rId6"/>
+                    <a:blip r:embed="rId7"/>
                     <a:srcRect b="0" l="0" r="0" t="0"/>
                     <a:stretch>
                       <a:fillRect/>
@@ -383,7 +393,7 @@
         <w:rPr>
           <w:rtl w:val="0"/>
         </w:rPr>
-        <w:t xml:space="preserve">Mr. Ascott clicked on the zipped file,  which sysmon detected and the alert showed that a file stream was created in temp files but after the Febrary.zip we can see </w:t>
+        <w:t xml:space="preserve">Mr. Ascott clicked on the zipped file,  which sysmon detected and the alert showed that a file stream was created in temp files but we see  </w:t>
       </w:r>
       <w:r>
         <w:rPr>
@@ -391,13 +401,27 @@
           <w:iCs w:val="1"/>
           <w:rtl w:val="0"/>
         </w:rPr>
-        <w:t xml:space="preserve">\\invoice.pdf.lnk.  </w:t>
-      </w:r>
-      <w:r>
-        <w:rPr>
-          <w:rtl w:val="0"/>
-        </w:rPr>
-        <w:t xml:space="preserve"> This tells us that there was a hidden file.</w:t>
+        <w:t xml:space="preserve">ImportantInvoice-Febrary\\invoice.pdf.lnk. </w:t>
+      </w:r>
+      <w:r>
+        <w:rPr>
+          <w:rtl w:val="0"/>
+        </w:rPr>
+        <w:t xml:space="preserve">The </w:t>
+      </w:r>
+      <w:r>
+        <w:rPr>
+          <w:i w:val="1"/>
+          <w:iCs w:val="1"/>
+          <w:rtl w:val="0"/>
+        </w:rPr>
+        <w:t xml:space="preserve">\\invoice.pdf.lnk</w:t>
+      </w:r>
+      <w:r>
+        <w:rPr>
+          <w:rtl w:val="0"/>
+        </w:rPr>
+        <w:t xml:space="preserve"> This tells us that there was a hidden file in the zipped file.</w:t>
       </w:r>
     </w:p>
     <w:p>
@@ -426,16 +450,16 @@
           <wp:inline distB="114300" distT="114300" distL="114300" distR="114300">
             <wp:extent cx="5943600" cy="584200"/>
             <wp:effectExtent b="0" l="0" r="0" t="0"/>
-            <wp:docPr id="2" name="image1.png"/>
+            <wp:docPr id="2" name="image2.png"/>
             <a:graphic>
               <a:graphicData uri="http://schemas.openxmlformats.org/drawingml/2006/picture">
                 <pic:pic>
                   <pic:nvPicPr>
-                    <pic:cNvPr id="0" name="image1.png"/>
+                    <pic:cNvPr id="0" name="image2.png"/>
                     <pic:cNvPicPr preferRelativeResize="0"/>
                   </pic:nvPicPr>
                   <pic:blipFill>
-                    <a:blip r:embed="rId7"/>
+                    <a:blip r:embed="rId8"/>
                     <a:srcRect b="0" l="0" r="0" t="0"/>
                     <a:stretch>
                       <a:fillRect/>
@@ -482,7 +506,7 @@
         <w:rPr>
           <w:rtl w:val="0"/>
         </w:rPr>
-        <w:t xml:space="preserve">Another sysmon alert shows that the launching of </w:t>
+        <w:t xml:space="preserve">Another sysmon alert shows that the launching of the hidden file, </w:t>
       </w:r>
       <w:r>
         <w:rPr>
@@ -496,7 +520,17 @@
         <w:rPr>
           <w:rtl w:val="0"/>
         </w:rPr>
-        <w:t xml:space="preserve">  opened powershell and created powercat.cs1.  This allowed a download from github as powershell has a cmdlet, IEX, which is used in attack scripts which can execute malicious code into memory without writing to disk. </w:t>
+        <w:t xml:space="preserve">. Which opened powershell and created powercat.cs1.  This allowed a download from github as powershell has a cmdlet, IEX (seen on the third line), which is used in attack scripts which can execute malicious code into memory without writing to disk. </w:t>
+      </w:r>
+    </w:p>
+    <w:p>
+      <w:pPr>
+        <w:rPr/>
+      </w:pPr>
+      <w:r>
+        <w:rPr>
+          <w:rtl w:val="0"/>
+        </w:rPr>
       </w:r>
     </w:p>
     <w:p>
@@ -512,16 +546,16 @@
           <wp:inline distB="114300" distT="114300" distL="114300" distR="114300">
             <wp:extent cx="5943600" cy="850900"/>
             <wp:effectExtent b="0" l="0" r="0" t="0"/>
-            <wp:docPr id="5" name="image5.png"/>
+            <wp:docPr id="5" name="image4.png"/>
             <a:graphic>
               <a:graphicData uri="http://schemas.openxmlformats.org/drawingml/2006/picture">
                 <pic:pic>
                   <pic:nvPicPr>
-                    <pic:cNvPr id="0" name="image5.png"/>
+                    <pic:cNvPr id="0" name="image4.png"/>
                     <pic:cNvPicPr preferRelativeResize="0"/>
                   </pic:nvPicPr>
                   <pic:blipFill>
-                    <a:blip r:embed="rId8"/>
+                    <a:blip r:embed="rId9"/>
                     <a:srcRect b="0" l="0" r="0" t="0"/>
                     <a:stretch>
                       <a:fillRect/>
@@ -586,28 +620,7 @@
         <w:rPr>
           <w:rtl w:val="0"/>
         </w:rPr>
-        <w:t xml:space="preserve">Which could then be used to transfer data between the two. </w:t>
-      </w:r>
-    </w:p>
-    <w:p>
-      <w:pPr>
-        <w:rPr/>
-      </w:pPr>
-      <w:r>
-        <w:rPr>
-          <w:rtl w:val="0"/>
-        </w:rPr>
-      </w:r>
-    </w:p>
-    <w:p>
-      <w:pPr>
-        <w:rPr/>
-      </w:pPr>
-      <w:r>
-        <w:rPr>
-          <w:rtl w:val="0"/>
-        </w:rPr>
-        <w:t xml:space="preserve">Ex.  </w:t>
+        <w:t xml:space="preserve">Which could then be used to transfer data between the two.  The -c lets us know it is a command  running on tcp to an endpoint on port 19282. The -e indicates an execution of the powershell code that follows.  </w:t>
       </w:r>
     </w:p>
     <w:p>
@@ -689,19 +702,29 @@
     </w:p>
     <w:p>
       <w:pPr>
-        <w:rPr>
-          <w:sz w:val="24"/>
-          <w:szCs w:val="24"/>
-        </w:rPr>
-      </w:pPr>
-      <w:r>
-        <w:rPr>
-          <w:sz w:val="24"/>
-          <w:szCs w:val="24"/>
-          <w:rtl w:val="0"/>
-        </w:rPr>
-        <w:t xml:space="preserve">here are two nslookup’s associated with this attack:  </w:t>
-      </w:r>
+        <w:ind w:left="0" w:firstLine="0"/>
+        <w:rPr>
+          <w:sz w:val="24"/>
+          <w:szCs w:val="24"/>
+        </w:rPr>
+      </w:pPr>
+      <w:r>
+        <w:rPr>
+          <w:sz w:val="24"/>
+          <w:szCs w:val="24"/>
+          <w:rtl w:val="0"/>
+        </w:rPr>
+        <w:t xml:space="preserve">There are two nslookup.exe actions associated with this attack:  </w:t>
+      </w:r>
+    </w:p>
+    <w:p>
+      <w:pPr>
+        <w:ind w:left="0" w:firstLine="720"/>
+        <w:rPr>
+          <w:sz w:val="24"/>
+          <w:szCs w:val="24"/>
+        </w:rPr>
+      </w:pPr>
       <w:r>
         <w:rPr>
           <w:rFonts w:ascii="Courier New" w:cs="Courier New" w:eastAsia="Courier New" w:hAnsi="Courier New"/>
@@ -717,7 +740,41 @@
           <w:szCs w:val="24"/>
           <w:rtl w:val="0"/>
         </w:rPr>
-        <w:t xml:space="preserve"> ==.haz4rdw4re.io  and </w:t>
+        <w:t xml:space="preserve"> ==.</w:t>
+      </w:r>
+      <w:hyperlink r:id="rId10">
+        <w:r>
+          <w:rPr>
+            <w:color w:val="1155cc"/>
+            <w:sz w:val="24"/>
+            <w:szCs w:val="24"/>
+            <w:u w:val="single"/>
+            <w:rtl w:val="0"/>
+          </w:rPr>
+          <w:t xml:space="preserve">haz4rdw4re.io</w:t>
+        </w:r>
+      </w:hyperlink>
+      <w:r>
+        <w:rPr>
+          <w:rtl w:val="0"/>
+        </w:rPr>
+      </w:r>
+    </w:p>
+    <w:p>
+      <w:pPr>
+        <w:ind w:left="720" w:firstLine="0"/>
+        <w:rPr>
+          <w:sz w:val="24"/>
+          <w:szCs w:val="24"/>
+        </w:rPr>
+      </w:pPr>
+      <w:r>
+        <w:rPr>
+          <w:sz w:val="24"/>
+          <w:szCs w:val="24"/>
+          <w:rtl w:val="0"/>
+        </w:rPr>
+        <w:t xml:space="preserve"> </w:t>
       </w:r>
       <w:r>
         <w:rPr>
@@ -734,7 +791,37 @@
           <w:szCs w:val="24"/>
           <w:rtl w:val="0"/>
         </w:rPr>
-        <w:t xml:space="preserve"> ==.haz4dw4re.io.    These appear to be an attempt to join two parts of information that can be reassembled into a whole later on. These were used to create the reverse tunnel. </w:t>
+        <w:t xml:space="preserve"> ==.haz4dw4re.io.   </w:t>
+      </w:r>
+    </w:p>
+    <w:p>
+      <w:pPr>
+        <w:ind w:left="720" w:firstLine="0"/>
+        <w:rPr>
+          <w:sz w:val="24"/>
+          <w:szCs w:val="24"/>
+        </w:rPr>
+      </w:pPr>
+      <w:r>
+        <w:rPr>
+          <w:rtl w:val="0"/>
+        </w:rPr>
+      </w:r>
+    </w:p>
+    <w:p>
+      <w:pPr>
+        <w:rPr>
+          <w:sz w:val="24"/>
+          <w:szCs w:val="24"/>
+        </w:rPr>
+      </w:pPr>
+      <w:r>
+        <w:rPr>
+          <w:sz w:val="24"/>
+          <w:szCs w:val="24"/>
+          <w:rtl w:val="0"/>
+        </w:rPr>
+        <w:t xml:space="preserve">I believe that these are an attempt to join two parts of information that can be reassembled into a whole to create the reverse tunnel. </w:t>
       </w:r>
     </w:p>
     <w:p>
@@ -767,16 +854,16 @@
           <wp:inline distB="114300" distT="114300" distL="114300" distR="114300">
             <wp:extent cx="5943600" cy="723900"/>
             <wp:effectExtent b="0" l="0" r="0" t="0"/>
-            <wp:docPr id="4" name="image4.png"/>
+            <wp:docPr id="4" name="image5.png"/>
             <a:graphic>
               <a:graphicData uri="http://schemas.openxmlformats.org/drawingml/2006/picture">
                 <pic:pic>
                   <pic:nvPicPr>
-                    <pic:cNvPr id="0" name="image4.png"/>
+                    <pic:cNvPr id="0" name="image5.png"/>
                     <pic:cNvPicPr preferRelativeResize="0"/>
                   </pic:nvPicPr>
                   <pic:blipFill>
-                    <a:blip r:embed="rId9"/>
+                    <a:blip r:embed="rId11"/>
                     <a:srcRect b="0" l="0" r="0" t="0"/>
                     <a:stretch>
                       <a:fillRect/>
@@ -835,8 +922,8 @@
                     <pic:cNvPicPr preferRelativeResize="0"/>
                   </pic:nvPicPr>
                   <pic:blipFill>
-                    <a:blip r:embed="rId10"/>
-                    <a:srcRect b="0" l="0" r="0" t="0"/>
+                    <a:blip r:embed="rId12"/>
+                    <a:srcRect b="4380" l="-11859" r="11859" t="-4380"/>
                     <a:stretch>
                       <a:fillRect/>
                     </a:stretch>
@@ -899,277 +986,315 @@
         <w:rPr>
           <w:b w:val="1"/>
           <w:bCs w:val="1"/>
-          <w:color w:val="3c444d"/>
           <w:sz w:val="28"/>
           <w:szCs w:val="28"/>
           <w:rtl w:val="0"/>
         </w:rPr>
-        <w:t xml:space="preserve">Indicators of </w:t>
-      </w:r>
-      <w:r>
+        <w:t xml:space="preserve">Indicators of the malicious email</w:t>
+      </w:r>
+    </w:p>
+    <w:p>
+      <w:pPr>
+        <w:rPr/>
+      </w:pPr>
+      <w:r>
+        <w:rPr>
+          <w:rtl w:val="0"/>
+        </w:rPr>
+      </w:r>
+    </w:p>
+    <w:p>
+      <w:pPr>
+        <w:rPr/>
+      </w:pPr>
+      <w:r>
+        <w:rPr>
+          <w:rtl w:val="0"/>
+        </w:rPr>
+        <w:t xml:space="preserve">Sender:  </w:t>
+      </w:r>
+      <w:r>
+        <w:rPr>
+          <w:rtl w:val="0"/>
+        </w:rPr>
+        <w:t xml:space="preserve">hatmakereurope.xyz</w:t>
+      </w:r>
+      <w:r>
+        <w:rPr>
+          <w:rtl w:val="0"/>
+        </w:rPr>
+        <w:t xml:space="preserve">  Note that this is not a normal top level domain.</w:t>
+      </w:r>
+    </w:p>
+    <w:p>
+      <w:pPr>
+        <w:rPr/>
+      </w:pPr>
+      <w:r>
+        <w:rPr>
+          <w:rtl w:val="0"/>
+        </w:rPr>
+      </w:r>
+    </w:p>
+    <w:p>
+      <w:pPr>
+        <w:rPr/>
+      </w:pPr>
+      <w:r>
+        <w:rPr>
+          <w:rtl w:val="0"/>
+        </w:rPr>
+        <w:t xml:space="preserve">Subject Line:  </w:t>
+      </w:r>
+      <w:r>
+        <w:rPr>
+          <w:i w:val="1"/>
+          <w:iCs w:val="1"/>
+          <w:rtl w:val="0"/>
+        </w:rPr>
+        <w:t xml:space="preserve">FINAL NOTICE: ….Overdue Payment.</w:t>
+      </w:r>
+      <w:r>
+        <w:rPr>
+          <w:rtl w:val="0"/>
+        </w:rPr>
+        <w:t xml:space="preserve">  This creates a sense of urgency.  </w:t>
+      </w:r>
+    </w:p>
+    <w:p>
+      <w:pPr>
+        <w:rPr/>
+      </w:pPr>
+      <w:r>
+        <w:rPr>
+          <w:rtl w:val="0"/>
+        </w:rPr>
+      </w:r>
+    </w:p>
+    <w:p>
+      <w:pPr>
+        <w:rPr/>
+      </w:pPr>
+      <w:r>
+        <w:rPr>
+          <w:rtl w:val="0"/>
+        </w:rPr>
+        <w:t xml:space="preserve">Body of email:  Urgent: Your account is 30 days past due…. Click the attached invoice immediately…    This also creates a sense of urgency so that the user will click without question.</w:t>
+      </w:r>
+    </w:p>
+    <w:p>
+      <w:pPr>
+        <w:rPr/>
+      </w:pPr>
+      <w:r>
+        <w:rPr>
+          <w:rtl w:val="0"/>
+        </w:rPr>
+      </w:r>
+    </w:p>
+    <w:p>
+      <w:pPr>
+        <w:rPr/>
+      </w:pPr>
+      <w:r>
+        <w:rPr>
+          <w:rtl w:val="0"/>
+        </w:rPr>
+        <w:t xml:space="preserve">Attachment Name:  ImportantInvoiceFebrary.zip   Note that February is spelled incorrectly, which could have been just a typo but in retrospect is an IOC indicator. </w:t>
+      </w:r>
+    </w:p>
+    <w:p>
+      <w:pPr>
+        <w:rPr/>
+      </w:pPr>
+      <w:r>
+        <w:rPr>
+          <w:rtl w:val="0"/>
+        </w:rPr>
+      </w:r>
+    </w:p>
+    <w:p>
+      <w:pPr>
+        <w:rPr/>
+      </w:pPr>
+      <w:r>
+        <w:rPr>
+          <w:rtl w:val="0"/>
+        </w:rPr>
+      </w:r>
+    </w:p>
+    <w:p>
+      <w:pPr>
         <w:rPr>
           <w:b w:val="1"/>
           <w:bCs w:val="1"/>
           <w:sz w:val="28"/>
           <w:szCs w:val="28"/>
-          <w:rtl w:val="0"/>
-        </w:rPr>
-        <w:t xml:space="preserve">the malicious email</w:t>
-      </w:r>
-    </w:p>
-    <w:p>
-      <w:pPr>
-        <w:rPr/>
-      </w:pPr>
-      <w:r>
-        <w:rPr>
-          <w:rtl w:val="0"/>
-        </w:rPr>
-      </w:r>
-    </w:p>
-    <w:p>
-      <w:pPr>
-        <w:rPr/>
-      </w:pPr>
-      <w:r>
-        <w:rPr>
-          <w:rtl w:val="0"/>
-        </w:rPr>
-        <w:t xml:space="preserve">Sender:  </w:t>
-      </w:r>
-      <w:r>
-        <w:rPr>
-          <w:rtl w:val="0"/>
-        </w:rPr>
-        <w:t xml:space="preserve">hatmakereurope.xyz</w:t>
-      </w:r>
-      <w:r>
-        <w:rPr>
-          <w:rtl w:val="0"/>
-        </w:rPr>
-        <w:t xml:space="preserve">  Note that this is not a normal top level domain.</w:t>
-      </w:r>
-    </w:p>
-    <w:p>
-      <w:pPr>
-        <w:rPr/>
-      </w:pPr>
-      <w:r>
-        <w:rPr>
-          <w:rtl w:val="0"/>
-        </w:rPr>
-      </w:r>
-    </w:p>
-    <w:p>
-      <w:pPr>
-        <w:rPr/>
-      </w:pPr>
-      <w:r>
-        <w:rPr>
-          <w:rtl w:val="0"/>
-        </w:rPr>
-        <w:t xml:space="preserve">Subject Line:  URGENT: Your account is 30 days past due… Open the attachment…   The term urgent, indicates a need for quick response </w:t>
-      </w:r>
-    </w:p>
-    <w:p>
-      <w:pPr>
-        <w:rPr/>
-      </w:pPr>
-      <w:r>
-        <w:rPr>
-          <w:rtl w:val="0"/>
-        </w:rPr>
-      </w:r>
-    </w:p>
-    <w:p>
-      <w:pPr>
-        <w:rPr/>
-      </w:pPr>
-      <w:r>
-        <w:rPr>
-          <w:rtl w:val="0"/>
-        </w:rPr>
-        <w:t xml:space="preserve">Attachment Name:  ImportantInvoiceFebrary.zip   Note that February is spelled incorrectly, which could have been just a typo but in retrospect is an IOC indicator. </w:t>
-      </w:r>
-    </w:p>
-    <w:p>
-      <w:pPr>
-        <w:rPr/>
-      </w:pPr>
-      <w:r>
-        <w:rPr>
-          <w:rtl w:val="0"/>
-        </w:rPr>
-      </w:r>
-    </w:p>
-    <w:p>
-      <w:pPr>
-        <w:rPr/>
-      </w:pPr>
-      <w:r>
-        <w:rPr>
-          <w:rtl w:val="0"/>
-        </w:rPr>
-      </w:r>
-    </w:p>
-    <w:p>
-      <w:pPr>
-        <w:rPr>
-          <w:b w:val="1"/>
-          <w:bCs w:val="1"/>
-        </w:rPr>
-      </w:pPr>
-      <w:r>
-        <w:rPr>
-          <w:b w:val="1"/>
-          <w:bCs w:val="1"/>
-          <w:rtl w:val="0"/>
-        </w:rPr>
-        <w:t xml:space="preserve">User Interaction:</w:t>
-      </w:r>
-    </w:p>
-    <w:p>
-      <w:pPr>
-        <w:rPr/>
-      </w:pPr>
-      <w:r>
-        <w:rPr>
-          <w:rtl w:val="0"/>
-        </w:rPr>
-      </w:r>
-    </w:p>
-    <w:p>
-      <w:pPr>
-        <w:rPr/>
-      </w:pPr>
-      <w:r>
-        <w:rPr>
-          <w:rtl w:val="0"/>
-        </w:rPr>
-        <w:t xml:space="preserve">Michael Ascot  clicked the zip file in the email which triggered the invoicepdf.lnk being installed</w:t>
-      </w:r>
-    </w:p>
-    <w:p>
-      <w:pPr>
-        <w:rPr/>
-      </w:pPr>
-      <w:r>
-        <w:rPr>
-          <w:rtl w:val="0"/>
-        </w:rPr>
-      </w:r>
-    </w:p>
-    <w:p>
-      <w:pPr>
-        <w:rPr>
-          <w:b w:val="1"/>
-          <w:bCs w:val="1"/>
-        </w:rPr>
-      </w:pPr>
-      <w:r>
-        <w:rPr>
-          <w:b w:val="1"/>
-          <w:bCs w:val="1"/>
-          <w:rtl w:val="0"/>
-        </w:rPr>
-        <w:t xml:space="preserve">Payload Execution:</w:t>
-      </w:r>
-    </w:p>
-    <w:p>
-      <w:pPr>
-        <w:rPr/>
-      </w:pPr>
-      <w:r>
-        <w:rPr>
-          <w:rtl w:val="0"/>
-        </w:rPr>
-      </w:r>
-    </w:p>
-    <w:p>
-      <w:pPr>
-        <w:rPr/>
-      </w:pPr>
-      <w:r>
-        <w:rPr>
-          <w:rtl w:val="0"/>
-        </w:rPr>
-        <w:t xml:space="preserve">See above in the attack breakdown for more information.</w:t>
-      </w:r>
-    </w:p>
-    <w:p>
-      <w:pPr>
-        <w:rPr/>
-      </w:pPr>
-      <w:r>
-        <w:rPr>
-          <w:rtl w:val="0"/>
-        </w:rPr>
-      </w:r>
-    </w:p>
-    <w:p>
-      <w:pPr>
-        <w:rPr/>
-      </w:pPr>
-      <w:r>
-        <w:rPr>
-          <w:rtl w:val="0"/>
-        </w:rPr>
-        <w:t xml:space="preserve">After invoice.pdf.lnk was activated that created the two part </w:t>
-      </w:r>
-      <w:r>
-        <w:rPr>
-          <w:rtl w:val="0"/>
-        </w:rPr>
-        <w:t xml:space="preserve">haz4rdw4re.io</w:t>
-      </w:r>
-      <w:r>
-        <w:rPr>
-          <w:rtl w:val="0"/>
-        </w:rPr>
-        <w:t xml:space="preserve"> which allowed for the tunnel creation between the internal host and the external host.  </w:t>
-      </w:r>
-    </w:p>
-    <w:p>
-      <w:pPr>
-        <w:rPr/>
-      </w:pPr>
-      <w:r>
-        <w:rPr>
-          <w:rtl w:val="0"/>
-        </w:rPr>
-        <w:t xml:space="preserve">The suspicious processes or behavior included  the .lnk script which launched powershell.  The hidden script allowed powercat.ps1 to be used. There were unusual parent/child relationships There were creation of temp files in relation to the malware execution.</w:t>
-      </w:r>
-    </w:p>
-    <w:p>
-      <w:pPr>
+        </w:rPr>
+      </w:pPr>
+      <w:r>
         <w:rPr>
           <w:b w:val="1"/>
           <w:bCs w:val="1"/>
           <w:sz w:val="28"/>
           <w:szCs w:val="28"/>
-        </w:rPr>
-      </w:pPr>
-      <w:r>
-        <w:rPr>
-          <w:rtl w:val="0"/>
-        </w:rPr>
-      </w:r>
-    </w:p>
-    <w:p>
-      <w:pPr>
+          <w:rtl w:val="0"/>
+        </w:rPr>
+        <w:t xml:space="preserve">User Interaction:</w:t>
+      </w:r>
+    </w:p>
+    <w:p>
+      <w:pPr>
+        <w:rPr/>
+      </w:pPr>
+      <w:r>
+        <w:rPr>
+          <w:rtl w:val="0"/>
+        </w:rPr>
+      </w:r>
+    </w:p>
+    <w:p>
+      <w:pPr>
+        <w:rPr/>
+      </w:pPr>
+      <w:r>
+        <w:rPr>
+          <w:rtl w:val="0"/>
+        </w:rPr>
+        <w:t xml:space="preserve">Michael Ascot  clicked the zip file in the email which triggered the invoicepdf.lnk being installed</w:t>
+      </w:r>
+    </w:p>
+    <w:p>
+      <w:pPr>
+        <w:rPr/>
+      </w:pPr>
+      <w:r>
+        <w:rPr>
+          <w:rtl w:val="0"/>
+        </w:rPr>
+      </w:r>
+    </w:p>
+    <w:p>
+      <w:pPr>
+        <w:rPr>
+          <w:b w:val="1"/>
+          <w:bCs w:val="1"/>
+        </w:rPr>
+      </w:pPr>
+      <w:r>
         <w:rPr>
           <w:b w:val="1"/>
           <w:bCs w:val="1"/>
           <w:sz w:val="28"/>
           <w:szCs w:val="28"/>
-        </w:rPr>
-      </w:pPr>
-      <w:r>
+          <w:rtl w:val="0"/>
+        </w:rPr>
+        <w:t xml:space="preserve">Payload Execution</w:t>
+      </w:r>
+      <w:r>
+        <w:rPr>
+          <w:b w:val="1"/>
+          <w:bCs w:val="1"/>
+          <w:rtl w:val="0"/>
+        </w:rPr>
+        <w:t xml:space="preserve">:</w:t>
+      </w:r>
+    </w:p>
+    <w:p>
+      <w:pPr>
+        <w:rPr/>
+      </w:pPr>
+      <w:r>
+        <w:rPr>
+          <w:rtl w:val="0"/>
+        </w:rPr>
+      </w:r>
+    </w:p>
+    <w:p>
+      <w:pPr>
+        <w:rPr/>
+      </w:pPr>
+      <w:r>
+        <w:rPr>
+          <w:rtl w:val="0"/>
+        </w:rPr>
+        <w:t xml:space="preserve">See above in the attack breakdown for more information.</w:t>
+      </w:r>
+    </w:p>
+    <w:p>
+      <w:pPr>
+        <w:rPr/>
+      </w:pPr>
+      <w:r>
+        <w:rPr>
+          <w:rtl w:val="0"/>
+        </w:rPr>
+      </w:r>
+    </w:p>
+    <w:p>
+      <w:pPr>
+        <w:rPr/>
+      </w:pPr>
+      <w:r>
+        <w:rPr>
+          <w:rtl w:val="0"/>
+        </w:rPr>
+        <w:t xml:space="preserve">After invoice.pdf.lnk was activated that created the two part </w:t>
+      </w:r>
+      <w:r>
+        <w:rPr>
+          <w:rtl w:val="0"/>
+        </w:rPr>
+        <w:t xml:space="preserve">haz4rdw4re.io</w:t>
+      </w:r>
+      <w:r>
+        <w:rPr>
+          <w:rtl w:val="0"/>
+        </w:rPr>
+        <w:t xml:space="preserve"> which allowed for the tunnel creation between the internal host and the external host.  </w:t>
+      </w:r>
+    </w:p>
+    <w:p>
+      <w:pPr>
+        <w:rPr/>
+      </w:pPr>
+      <w:r>
+        <w:rPr>
+          <w:rtl w:val="0"/>
+        </w:rPr>
+        <w:t xml:space="preserve">The suspicious processes or behavior included  the .lnk script which launched powershell.  The hidden script allowed powercat.ps1 to be used. There were unusual parent/child relationships There were creation of temp files in relation to the malware execution.</w:t>
+      </w:r>
+    </w:p>
+    <w:p>
+      <w:pPr>
         <w:rPr>
           <w:b w:val="1"/>
           <w:bCs w:val="1"/>
           <w:sz w:val="28"/>
           <w:szCs w:val="28"/>
+        </w:rPr>
+      </w:pPr>
+      <w:r>
+        <w:rPr>
+          <w:rtl w:val="0"/>
+        </w:rPr>
+      </w:r>
+    </w:p>
+    <w:p>
+      <w:pPr>
+        <w:rPr>
+          <w:b w:val="1"/>
+          <w:bCs w:val="1"/>
+          <w:sz w:val="28"/>
+          <w:szCs w:val="28"/>
+        </w:rPr>
+      </w:pPr>
+      <w:r>
+        <w:rPr>
+          <w:b w:val="1"/>
+          <w:bCs w:val="1"/>
+          <w:sz w:val="28"/>
+          <w:szCs w:val="28"/>
           <w:rtl w:val="0"/>
         </w:rPr>
         <w:t xml:space="preserve">Post-Compromise Activity</w:t>
@@ -1194,6 +1319,1585 @@
           <w:rtl w:val="0"/>
         </w:rPr>
         <w:t xml:space="preserve">( STILL NEED TO FIGURE THIS OUT)</w:t>
+      </w:r>
+    </w:p>
+    <w:p>
+      <w:pPr>
+        <w:rPr/>
+      </w:pPr>
+      <w:r>
+        <w:rPr>
+          <w:rtl w:val="0"/>
+        </w:rPr>
+      </w:r>
+    </w:p>
+    <w:p>
+      <w:pPr>
+        <w:rPr/>
+      </w:pPr>
+      <w:r>
+        <w:rPr>
+          <w:rtl w:val="0"/>
+        </w:rPr>
+      </w:r>
+    </w:p>
+    <w:p>
+      <w:pPr>
+        <w:rPr/>
+      </w:pPr>
+      <w:r>
+        <w:rPr>
+          <w:rtl w:val="0"/>
+        </w:rPr>
+      </w:r>
+    </w:p>
+    <w:p>
+      <w:pPr>
+        <w:rPr>
+          <w:b w:val="1"/>
+          <w:bCs w:val="1"/>
+          <w:sz w:val="36"/>
+          <w:szCs w:val="36"/>
+        </w:rPr>
+      </w:pPr>
+      <w:r>
+        <w:rPr>
+          <w:b w:val="1"/>
+          <w:bCs w:val="1"/>
+          <w:sz w:val="36"/>
+          <w:szCs w:val="36"/>
+          <w:rtl w:val="0"/>
+        </w:rPr>
+        <w:t xml:space="preserve">Detection Opportunities</w:t>
+      </w:r>
+    </w:p>
+    <w:p>
+      <w:pPr>
+        <w:rPr>
+          <w:b w:val="1"/>
+          <w:bCs w:val="1"/>
+        </w:rPr>
+      </w:pPr>
+      <w:r>
+        <w:rPr>
+          <w:rtl w:val="0"/>
+        </w:rPr>
+      </w:r>
+    </w:p>
+    <w:p>
+      <w:pPr>
+        <w:numPr>
+          <w:ilvl w:val="0"/>
+          <w:numId w:val="1"/>
+        </w:numPr>
+        <w:ind w:left="720" w:hanging="360"/>
+        <w:rPr>
+          <w:u w:val="none"/>
+        </w:rPr>
+      </w:pPr>
+      <w:r>
+        <w:rPr>
+          <w:rtl w:val="0"/>
+        </w:rPr>
+        <w:t xml:space="preserve">The sender’s email address:  Did the recipient know them? Did they recognize the top-level domain?</w:t>
+      </w:r>
+    </w:p>
+    <w:p>
+      <w:pPr>
+        <w:numPr>
+          <w:ilvl w:val="0"/>
+          <w:numId w:val="1"/>
+        </w:numPr>
+        <w:ind w:left="720" w:hanging="360"/>
+        <w:rPr>
+          <w:u w:val="none"/>
+        </w:rPr>
+      </w:pPr>
+      <w:r>
+        <w:rPr>
+          <w:rtl w:val="0"/>
+        </w:rPr>
+        <w:t xml:space="preserve">The subject line and body of the email both creating a false sense of urgency.</w:t>
+      </w:r>
+    </w:p>
+    <w:p>
+      <w:pPr>
+        <w:numPr>
+          <w:ilvl w:val="0"/>
+          <w:numId w:val="1"/>
+        </w:numPr>
+        <w:ind w:left="720" w:hanging="360"/>
+        <w:rPr>
+          <w:u w:val="none"/>
+        </w:rPr>
+      </w:pPr>
+      <w:r>
+        <w:rPr>
+          <w:rtl w:val="0"/>
+        </w:rPr>
+        <w:t xml:space="preserve">Attachment name:  the misspelling of February  and possibly the timing of the invoice.</w:t>
+      </w:r>
+      <w:r>
+        <w:rPr>
+          <w:b w:val="1"/>
+          <w:bCs w:val="1"/>
+          <w:rtl w:val="0"/>
+        </w:rPr>
+        <w:t xml:space="preserve"> </w:t>
+      </w:r>
+    </w:p>
+    <w:p>
+      <w:pPr>
+        <w:numPr>
+          <w:ilvl w:val="0"/>
+          <w:numId w:val="1"/>
+        </w:numPr>
+        <w:ind w:left="720" w:hanging="360"/>
+        <w:rPr/>
+      </w:pPr>
+      <w:r>
+        <w:rPr>
+          <w:rtl w:val="0"/>
+        </w:rPr>
+        <w:t xml:space="preserve">After the attachment was open, as soon as the pdf.lnk was detected</w:t>
+      </w:r>
+    </w:p>
+    <w:p>
+      <w:pPr>
+        <w:numPr>
+          <w:ilvl w:val="0"/>
+          <w:numId w:val="1"/>
+        </w:numPr>
+        <w:ind w:left="720" w:hanging="360"/>
+        <w:rPr>
+          <w:u w:val="none"/>
+        </w:rPr>
+      </w:pPr>
+      <w:r>
+        <w:rPr>
+          <w:rtl w:val="0"/>
+        </w:rPr>
+        <w:t xml:space="preserve">Powershell.exe being activated.  This suspicious behavior could have triggered an investigation.</w:t>
+      </w:r>
+    </w:p>
+    <w:p>
+      <w:pPr>
+        <w:rPr/>
+      </w:pPr>
+      <w:r>
+        <w:rPr>
+          <w:rtl w:val="0"/>
+        </w:rPr>
+      </w:r>
+    </w:p>
+    <w:p>
+      <w:pPr>
+        <w:rPr/>
+      </w:pPr>
+      <w:r>
+        <w:rPr>
+          <w:rtl w:val="0"/>
+        </w:rPr>
+        <w:t xml:space="preserve">The first three opportunities were found in the email itself. Should those have been noticed the attack may not have been successful. .  The last two could have, once noticed,  triggered an isolation of Mr. Ascots system and minimized any damage caused.</w:t>
+      </w:r>
+    </w:p>
+    <w:p>
+      <w:pPr>
+        <w:rPr>
+          <w:sz w:val="36"/>
+          <w:szCs w:val="36"/>
+        </w:rPr>
+      </w:pPr>
+      <w:r>
+        <w:rPr>
+          <w:rtl w:val="0"/>
+        </w:rPr>
+      </w:r>
+    </w:p>
+    <w:p>
+      <w:pPr>
+        <w:rPr>
+          <w:b w:val="1"/>
+          <w:bCs w:val="1"/>
+          <w:sz w:val="36"/>
+          <w:szCs w:val="36"/>
+        </w:rPr>
+      </w:pPr>
+      <w:r>
+        <w:rPr>
+          <w:b w:val="1"/>
+          <w:bCs w:val="1"/>
+          <w:sz w:val="36"/>
+          <w:szCs w:val="36"/>
+          <w:rtl w:val="0"/>
+        </w:rPr>
+        <w:t xml:space="preserve">Detection Rules</w:t>
+      </w:r>
+    </w:p>
+    <w:p>
+      <w:pPr>
+        <w:ind w:left="0" w:firstLine="0"/>
+        <w:rPr>
+          <w:sz w:val="24"/>
+          <w:szCs w:val="24"/>
+        </w:rPr>
+      </w:pPr>
+      <w:r>
+        <w:rPr>
+          <w:rtl w:val="0"/>
+        </w:rPr>
+      </w:r>
+    </w:p>
+    <w:p>
+      <w:pPr>
+        <w:ind w:left="0" w:firstLine="0"/>
+        <w:rPr>
+          <w:sz w:val="24"/>
+          <w:szCs w:val="24"/>
+        </w:rPr>
+      </w:pPr>
+      <w:r>
+        <w:rPr>
+          <w:b w:val="1"/>
+          <w:bCs w:val="1"/>
+          <w:sz w:val="24"/>
+          <w:szCs w:val="24"/>
+          <w:rtl w:val="0"/>
+        </w:rPr>
+        <w:t xml:space="preserve">1) </w:t>
+        <w:tab/>
+      </w:r>
+      <w:r>
+        <w:rPr>
+          <w:sz w:val="24"/>
+          <w:szCs w:val="24"/>
+          <w:rtl w:val="0"/>
+        </w:rPr>
+        <w:t xml:space="preserve">Detection name: Email Aware</w:t>
+      </w:r>
+    </w:p>
+    <w:p>
+      <w:pPr>
+        <w:ind w:left="0" w:firstLine="0"/>
+        <w:rPr>
+          <w:sz w:val="24"/>
+          <w:szCs w:val="24"/>
+        </w:rPr>
+      </w:pPr>
+      <w:r>
+        <w:rPr>
+          <w:sz w:val="24"/>
+          <w:szCs w:val="24"/>
+          <w:rtl w:val="0"/>
+        </w:rPr>
+        <w:tab/>
+        <w:t xml:space="preserve">Logic:  If an email is received from an unfamiliar domain, with zipped files or other unusual information, then do not engage until it has been investigated. </w:t>
+      </w:r>
+    </w:p>
+    <w:p>
+      <w:pPr>
+        <w:ind w:left="0" w:firstLine="0"/>
+        <w:rPr>
+          <w:sz w:val="24"/>
+          <w:szCs w:val="24"/>
+        </w:rPr>
+      </w:pPr>
+      <w:r>
+        <w:rPr>
+          <w:sz w:val="24"/>
+          <w:szCs w:val="24"/>
+          <w:rtl w:val="0"/>
+        </w:rPr>
+        <w:t xml:space="preserve">Data Source:  for email attacks, the logs regarding the email itself.  </w:t>
+      </w:r>
+    </w:p>
+    <w:p>
+      <w:pPr>
+        <w:ind w:left="0" w:firstLine="0"/>
+        <w:rPr>
+          <w:sz w:val="24"/>
+          <w:szCs w:val="24"/>
+        </w:rPr>
+      </w:pPr>
+      <w:r>
+        <w:rPr>
+          <w:rtl w:val="0"/>
+        </w:rPr>
+      </w:r>
+    </w:p>
+    <w:p>
+      <w:pPr>
+        <w:ind w:left="0" w:firstLine="0"/>
+        <w:rPr>
+          <w:sz w:val="24"/>
+          <w:szCs w:val="24"/>
+        </w:rPr>
+      </w:pPr>
+      <w:r>
+        <w:rPr>
+          <w:b w:val="1"/>
+          <w:bCs w:val="1"/>
+          <w:sz w:val="24"/>
+          <w:szCs w:val="24"/>
+          <w:rtl w:val="0"/>
+        </w:rPr>
+        <w:t xml:space="preserve">2)</w:t>
+      </w:r>
+      <w:r>
+        <w:rPr>
+          <w:sz w:val="24"/>
+          <w:szCs w:val="24"/>
+          <w:rtl w:val="0"/>
+        </w:rPr>
+        <w:tab/>
+        <w:t xml:space="preserve">Detection name: Unusual Parent/Child relationship</w:t>
+      </w:r>
+    </w:p>
+    <w:p>
+      <w:pPr>
+        <w:ind w:left="0" w:firstLine="0"/>
+        <w:rPr>
+          <w:sz w:val="24"/>
+          <w:szCs w:val="24"/>
+        </w:rPr>
+      </w:pPr>
+      <w:r>
+        <w:rPr>
+          <w:sz w:val="24"/>
+          <w:szCs w:val="24"/>
+          <w:rtl w:val="0"/>
+        </w:rPr>
+        <w:tab/>
+        <w:t xml:space="preserve">Logic: If the event shows an unusual parent/child relationship, then view the log for more information.  For example, explorer.exe opens powershell to run code that may be malicious.</w:t>
+      </w:r>
+    </w:p>
+    <w:p>
+      <w:pPr>
+        <w:ind w:left="0" w:firstLine="0"/>
+        <w:rPr>
+          <w:sz w:val="24"/>
+          <w:szCs w:val="24"/>
+        </w:rPr>
+      </w:pPr>
+      <w:r>
+        <w:rPr>
+          <w:sz w:val="24"/>
+          <w:szCs w:val="24"/>
+          <w:rtl w:val="0"/>
+        </w:rPr>
+        <w:tab/>
+        <w:t xml:space="preserve">Data:  Check the event logs. </w:t>
+      </w:r>
+    </w:p>
+    <w:p>
+      <w:pPr>
+        <w:ind w:left="0" w:firstLine="0"/>
+        <w:rPr>
+          <w:sz w:val="24"/>
+          <w:szCs w:val="24"/>
+        </w:rPr>
+      </w:pPr>
+      <w:r>
+        <w:rPr>
+          <w:rtl w:val="0"/>
+        </w:rPr>
+      </w:r>
+    </w:p>
+    <w:p>
+      <w:pPr>
+        <w:ind w:left="0" w:firstLine="0"/>
+        <w:rPr>
+          <w:sz w:val="24"/>
+          <w:szCs w:val="24"/>
+        </w:rPr>
+      </w:pPr>
+      <w:r>
+        <w:rPr>
+          <w:b w:val="1"/>
+          <w:bCs w:val="1"/>
+          <w:sz w:val="24"/>
+          <w:szCs w:val="24"/>
+          <w:rtl w:val="0"/>
+        </w:rPr>
+        <w:t xml:space="preserve">3)</w:t>
+        <w:tab/>
+      </w:r>
+      <w:r>
+        <w:rPr>
+          <w:sz w:val="24"/>
+          <w:szCs w:val="24"/>
+          <w:rtl w:val="0"/>
+        </w:rPr>
+        <w:t xml:space="preserve">Detection Name:   Reverse Shell</w:t>
+      </w:r>
+    </w:p>
+    <w:p>
+      <w:pPr>
+        <w:ind w:left="0" w:firstLine="0"/>
+        <w:rPr>
+          <w:sz w:val="24"/>
+          <w:szCs w:val="24"/>
+        </w:rPr>
+      </w:pPr>
+      <w:r>
+        <w:rPr>
+          <w:sz w:val="24"/>
+          <w:szCs w:val="24"/>
+          <w:rtl w:val="0"/>
+        </w:rPr>
+        <w:tab/>
+        <w:t xml:space="preserve">Logic:  If the system is making unexpected connections on known ports, then investigate the logs.</w:t>
+      </w:r>
+    </w:p>
+    <w:p>
+      <w:pPr>
+        <w:rPr>
+          <w:sz w:val="24"/>
+          <w:szCs w:val="24"/>
+        </w:rPr>
+      </w:pPr>
+      <w:r>
+        <w:rPr>
+          <w:sz w:val="24"/>
+          <w:szCs w:val="24"/>
+          <w:rtl w:val="0"/>
+        </w:rPr>
+        <w:tab/>
+        <w:t xml:space="preserve">Data: Check the logs for indications that the connection was completed.</w:t>
+      </w:r>
+    </w:p>
+    <w:p>
+      <w:pPr>
+        <w:rPr>
+          <w:sz w:val="24"/>
+          <w:szCs w:val="24"/>
+        </w:rPr>
+      </w:pPr>
+      <w:r>
+        <w:rPr>
+          <w:rtl w:val="0"/>
+        </w:rPr>
+      </w:r>
+    </w:p>
+    <w:p>
+      <w:pPr>
+        <w:rPr>
+          <w:sz w:val="24"/>
+          <w:szCs w:val="24"/>
+        </w:rPr>
+      </w:pPr>
+      <w:r>
+        <w:rPr>
+          <w:rtl w:val="0"/>
+        </w:rPr>
+      </w:r>
+    </w:p>
+    <w:p>
+      <w:pPr>
+        <w:rPr>
+          <w:b w:val="1"/>
+          <w:bCs w:val="1"/>
+          <w:sz w:val="36"/>
+          <w:szCs w:val="36"/>
+        </w:rPr>
+      </w:pPr>
+      <w:r>
+        <w:rPr>
+          <w:rtl w:val="0"/>
+        </w:rPr>
+      </w:r>
+    </w:p>
+    <w:p>
+      <w:pPr>
+        <w:rPr>
+          <w:b w:val="1"/>
+          <w:bCs w:val="1"/>
+          <w:sz w:val="36"/>
+          <w:szCs w:val="36"/>
+        </w:rPr>
+      </w:pPr>
+      <w:r>
+        <w:rPr>
+          <w:rtl w:val="0"/>
+        </w:rPr>
+      </w:r>
+    </w:p>
+    <w:p>
+      <w:pPr>
+        <w:rPr>
+          <w:b w:val="1"/>
+          <w:bCs w:val="1"/>
+          <w:sz w:val="36"/>
+          <w:szCs w:val="36"/>
+        </w:rPr>
+      </w:pPr>
+      <w:r>
+        <w:rPr>
+          <w:b w:val="1"/>
+          <w:bCs w:val="1"/>
+          <w:sz w:val="36"/>
+          <w:szCs w:val="36"/>
+          <w:rtl w:val="0"/>
+        </w:rPr>
+        <w:t xml:space="preserve">SOC WORKFLOW INTEGRATION</w:t>
+      </w:r>
+    </w:p>
+    <w:p>
+      <w:pPr>
+        <w:rPr>
+          <w:sz w:val="24"/>
+          <w:szCs w:val="24"/>
+        </w:rPr>
+      </w:pPr>
+      <w:r>
+        <w:rPr>
+          <w:rtl w:val="0"/>
+        </w:rPr>
+      </w:r>
+    </w:p>
+    <w:p>
+      <w:pPr>
+        <w:rPr>
+          <w:sz w:val="24"/>
+          <w:szCs w:val="24"/>
+        </w:rPr>
+      </w:pPr>
+      <w:r>
+        <w:rPr>
+          <w:sz w:val="24"/>
+          <w:szCs w:val="24"/>
+          <w:rtl w:val="0"/>
+        </w:rPr>
+        <w:t xml:space="preserve">Each action would create an entry into the logs based on what looks to be unusual behaviour.  To do the triage, check SIEM using the appropriate log files, read it carefully to determine if the threat is legitimate or a false positive.  If the event creates further activity, such as opening powershell to execute code, escalate the event.  Depending on the level of the threat, escalation with low, med, or high severity should occur. For example, if the event targets an important person, department or information, then escalate the event  with high severity.</w:t>
+      </w:r>
+    </w:p>
+    <w:p>
+      <w:pPr>
+        <w:rPr>
+          <w:sz w:val="24"/>
+          <w:szCs w:val="24"/>
+        </w:rPr>
+      </w:pPr>
+      <w:r>
+        <w:rPr>
+          <w:rtl w:val="0"/>
+        </w:rPr>
+      </w:r>
+    </w:p>
+    <w:p>
+      <w:pPr>
+        <w:rPr>
+          <w:b w:val="1"/>
+          <w:bCs w:val="1"/>
+          <w:sz w:val="36"/>
+          <w:szCs w:val="36"/>
+        </w:rPr>
+      </w:pPr>
+      <w:r>
+        <w:rPr>
+          <w:b w:val="1"/>
+          <w:bCs w:val="1"/>
+          <w:sz w:val="36"/>
+          <w:szCs w:val="36"/>
+          <w:rtl w:val="0"/>
+        </w:rPr>
+        <w:t xml:space="preserve">False Positives and Tuning</w:t>
+      </w:r>
+    </w:p>
+    <w:p>
+      <w:pPr>
+        <w:spacing w:line="240" w:lineRule="auto"/>
+        <w:rPr>
+          <w:b w:val="1"/>
+          <w:bCs w:val="1"/>
+          <w:sz w:val="36"/>
+          <w:szCs w:val="36"/>
+        </w:rPr>
+      </w:pPr>
+      <w:r>
+        <w:rPr>
+          <w:rtl w:val="0"/>
+        </w:rPr>
+      </w:r>
+    </w:p>
+    <w:p>
+      <w:pPr>
+        <w:spacing w:line="240" w:lineRule="auto"/>
+        <w:rPr>
+          <w:b w:val="1"/>
+          <w:bCs w:val="1"/>
+          <w:sz w:val="36"/>
+          <w:szCs w:val="36"/>
+        </w:rPr>
+      </w:pPr>
+      <w:r>
+        <w:rPr>
+          <w:sz w:val="24"/>
+          <w:szCs w:val="24"/>
+          <w:rtl w:val="0"/>
+        </w:rPr>
+        <w:t xml:space="preserve">Any behaviour that looks, on the surface, like malicious behavior, could trigger a false positive.  For example, opening an email from an unusual source or clicking a misspelled zip file. To reduce the number of False Positives events, a review of past false positive results and then an adjustment of the detection levels and rules accordingly.</w:t>
+      </w:r>
+      <w:r>
+        <w:rPr>
+          <w:rtl w:val="0"/>
+        </w:rPr>
+      </w:r>
+    </w:p>
+    <w:p>
+      <w:pPr>
+        <w:rPr>
+          <w:b w:val="1"/>
+          <w:bCs w:val="1"/>
+          <w:sz w:val="36"/>
+          <w:szCs w:val="36"/>
+        </w:rPr>
+      </w:pPr>
+      <w:r>
+        <w:rPr>
+          <w:rtl w:val="0"/>
+        </w:rPr>
+      </w:r>
+    </w:p>
+    <w:p>
+      <w:pPr>
+        <w:rPr>
+          <w:b w:val="1"/>
+          <w:bCs w:val="1"/>
+          <w:sz w:val="36"/>
+          <w:szCs w:val="36"/>
+        </w:rPr>
+      </w:pPr>
+      <w:r>
+        <w:rPr>
+          <w:b w:val="1"/>
+          <w:bCs w:val="1"/>
+          <w:sz w:val="36"/>
+          <w:szCs w:val="36"/>
+          <w:rtl w:val="0"/>
+        </w:rPr>
+        <w:t xml:space="preserve">Detection Gaps</w:t>
+        <w:br w:type="textWrapping"/>
+        <w:t xml:space="preserve">Discuss</w:t>
+      </w:r>
+    </w:p>
+    <w:p>
+      <w:pPr>
+        <w:shd w:fill="ffffff" w:val="clear"/>
+        <w:spacing w:line="240" w:lineRule="auto"/>
+        <w:rPr>
+          <w:b w:val="1"/>
+          <w:bCs w:val="1"/>
+          <w:sz w:val="36"/>
+          <w:szCs w:val="36"/>
+        </w:rPr>
+      </w:pPr>
+      <w:r>
+        <w:rPr>
+          <w:rtl w:val="0"/>
+        </w:rPr>
+      </w:r>
+    </w:p>
+    <w:p>
+      <w:pPr>
+        <w:shd w:fill="ffffff" w:val="clear"/>
+        <w:spacing w:line="240" w:lineRule="auto"/>
+        <w:rPr>
+          <w:color w:val="38556a"/>
+          <w:sz w:val="21"/>
+          <w:szCs w:val="21"/>
+        </w:rPr>
+      </w:pPr>
+      <w:r>
+        <w:rPr>
+          <w:rtl w:val="0"/>
+        </w:rPr>
+      </w:r>
+    </w:p>
+    <w:p>
+      <w:pPr>
+        <w:shd w:fill="ffffff" w:val="clear"/>
+        <w:spacing w:line="240" w:lineRule="auto"/>
+        <w:rPr>
+          <w:color w:val="38556a"/>
+          <w:sz w:val="16"/>
+          <w:szCs w:val="16"/>
+        </w:rPr>
+      </w:pPr>
+      <w:r>
+        <w:rPr>
+          <w:color w:val="38556a"/>
+          <w:sz w:val="16"/>
+          <w:szCs w:val="16"/>
+          <w:rtl w:val="0"/>
+        </w:rPr>
+        <w:t xml:space="preserve">portions of the attack that may not be detected</w:t>
+      </w:r>
+    </w:p>
+    <w:p>
+      <w:pPr>
+        <w:shd w:fill="ffffff" w:val="clear"/>
+        <w:spacing w:line="240" w:lineRule="auto"/>
+        <w:rPr>
+          <w:color w:val="38556a"/>
+          <w:sz w:val="21"/>
+          <w:szCs w:val="21"/>
+        </w:rPr>
+      </w:pPr>
+      <w:r>
+        <w:rPr>
+          <w:rtl w:val="0"/>
+        </w:rPr>
+      </w:r>
+    </w:p>
+    <w:p>
+      <w:pPr>
+        <w:shd w:fill="ffffff" w:val="clear"/>
+        <w:spacing w:line="240" w:lineRule="auto"/>
+        <w:rPr>
+          <w:color w:val="38556a"/>
+          <w:sz w:val="16"/>
+          <w:szCs w:val="16"/>
+        </w:rPr>
+      </w:pPr>
+      <w:r>
+        <w:rPr>
+          <w:color w:val="38556a"/>
+          <w:sz w:val="16"/>
+          <w:szCs w:val="16"/>
+          <w:rtl w:val="0"/>
+        </w:rPr>
+        <w:t xml:space="preserve">additional logging or tooling that would improve visibility</w:t>
+      </w:r>
+    </w:p>
+    <w:p>
+      <w:pPr>
+        <w:shd w:fill="ffffff" w:val="clear"/>
+        <w:spacing w:line="240" w:lineRule="auto"/>
+        <w:rPr>
+          <w:color w:val="38556a"/>
+          <w:sz w:val="21"/>
+          <w:szCs w:val="21"/>
+        </w:rPr>
+      </w:pPr>
+      <w:r>
+        <w:rPr>
+          <w:rtl w:val="0"/>
+        </w:rPr>
+      </w:r>
+    </w:p>
+    <w:p>
+      <w:pPr>
+        <w:shd w:fill="ffffff" w:val="clear"/>
+        <w:spacing w:line="240" w:lineRule="auto"/>
+        <w:rPr>
+          <w:color w:val="38556a"/>
+          <w:sz w:val="24"/>
+          <w:szCs w:val="24"/>
+        </w:rPr>
+      </w:pPr>
+      <w:r>
+        <w:rPr>
+          <w:color w:val="38556a"/>
+          <w:sz w:val="24"/>
+          <w:szCs w:val="24"/>
+          <w:rtl w:val="0"/>
+        </w:rPr>
+        <w:t xml:space="preserve">🔹</w:t>
+      </w:r>
+    </w:p>
+    <w:p>
+      <w:pPr>
+        <w:shd w:fill="ffffff" w:val="clear"/>
+        <w:spacing w:line="240" w:lineRule="auto"/>
+        <w:rPr>
+          <w:color w:val="38556a"/>
+          <w:sz w:val="24"/>
+          <w:szCs w:val="24"/>
+        </w:rPr>
+      </w:pPr>
+      <w:r>
+        <w:rPr>
+          <w:color w:val="38556a"/>
+          <w:sz w:val="24"/>
+          <w:szCs w:val="24"/>
+          <w:rtl w:val="0"/>
+        </w:rPr>
+        <w:t xml:space="preserve">8. Recommendations</w:t>
+      </w:r>
+    </w:p>
+    <w:p>
+      <w:pPr>
+        <w:shd w:fill="ffffff" w:val="clear"/>
+        <w:spacing w:line="240" w:lineRule="auto"/>
+        <w:rPr>
+          <w:color w:val="38556a"/>
+          <w:sz w:val="21"/>
+          <w:szCs w:val="21"/>
+        </w:rPr>
+      </w:pPr>
+      <w:r>
+        <w:rPr>
+          <w:rtl w:val="0"/>
+        </w:rPr>
+      </w:r>
+    </w:p>
+    <w:p>
+      <w:pPr>
+        <w:shd w:fill="ffffff" w:val="clear"/>
+        <w:spacing w:line="240" w:lineRule="auto"/>
+        <w:rPr>
+          <w:color w:val="38556a"/>
+          <w:sz w:val="18"/>
+          <w:szCs w:val="18"/>
+        </w:rPr>
+      </w:pPr>
+      <w:r>
+        <w:rPr>
+          <w:color w:val="38556a"/>
+          <w:sz w:val="18"/>
+          <w:szCs w:val="18"/>
+          <w:rtl w:val="0"/>
+        </w:rPr>
+        <w:t xml:space="preserve">Immediate Improvements</w:t>
+      </w:r>
+    </w:p>
+    <w:p>
+      <w:pPr>
+        <w:shd w:fill="ffffff" w:val="clear"/>
+        <w:spacing w:line="240" w:lineRule="auto"/>
+        <w:rPr>
+          <w:color w:val="38556a"/>
+          <w:sz w:val="21"/>
+          <w:szCs w:val="21"/>
+        </w:rPr>
+      </w:pPr>
+      <w:r>
+        <w:rPr>
+          <w:rtl w:val="0"/>
+        </w:rPr>
+      </w:r>
+    </w:p>
+    <w:p>
+      <w:pPr>
+        <w:shd w:fill="ffffff" w:val="clear"/>
+        <w:spacing w:line="240" w:lineRule="auto"/>
+        <w:rPr>
+          <w:color w:val="38556a"/>
+          <w:sz w:val="16"/>
+          <w:szCs w:val="16"/>
+        </w:rPr>
+      </w:pPr>
+      <w:r>
+        <w:rPr>
+          <w:color w:val="38556a"/>
+          <w:sz w:val="16"/>
+          <w:szCs w:val="16"/>
+          <w:rtl w:val="0"/>
+        </w:rPr>
+        <w:t xml:space="preserve">Examples:</w:t>
+      </w:r>
+    </w:p>
+    <w:p>
+      <w:pPr>
+        <w:shd w:fill="ffffff" w:val="clear"/>
+        <w:spacing w:line="240" w:lineRule="auto"/>
+        <w:rPr>
+          <w:color w:val="38556a"/>
+          <w:sz w:val="21"/>
+          <w:szCs w:val="21"/>
+        </w:rPr>
+      </w:pPr>
+      <w:r>
+        <w:rPr>
+          <w:rtl w:val="0"/>
+        </w:rPr>
+      </w:r>
+    </w:p>
+    <w:p>
+      <w:pPr>
+        <w:shd w:fill="ffffff" w:val="clear"/>
+        <w:spacing w:line="240" w:lineRule="auto"/>
+        <w:rPr>
+          <w:color w:val="38556a"/>
+          <w:sz w:val="16"/>
+          <w:szCs w:val="16"/>
+        </w:rPr>
+      </w:pPr>
+      <w:r>
+        <w:rPr>
+          <w:color w:val="38556a"/>
+          <w:sz w:val="16"/>
+          <w:szCs w:val="16"/>
+          <w:rtl w:val="0"/>
+        </w:rPr>
+        <w:t xml:space="preserve">block malicious domains</w:t>
+      </w:r>
+    </w:p>
+    <w:p>
+      <w:pPr>
+        <w:shd w:fill="ffffff" w:val="clear"/>
+        <w:spacing w:line="240" w:lineRule="auto"/>
+        <w:rPr>
+          <w:color w:val="38556a"/>
+          <w:sz w:val="21"/>
+          <w:szCs w:val="21"/>
+        </w:rPr>
+      </w:pPr>
+      <w:r>
+        <w:rPr>
+          <w:rtl w:val="0"/>
+        </w:rPr>
+      </w:r>
+    </w:p>
+    <w:p>
+      <w:pPr>
+        <w:shd w:fill="ffffff" w:val="clear"/>
+        <w:spacing w:line="240" w:lineRule="auto"/>
+        <w:rPr>
+          <w:color w:val="38556a"/>
+          <w:sz w:val="16"/>
+          <w:szCs w:val="16"/>
+        </w:rPr>
+      </w:pPr>
+      <w:r>
+        <w:rPr>
+          <w:color w:val="38556a"/>
+          <w:sz w:val="16"/>
+          <w:szCs w:val="16"/>
+          <w:rtl w:val="0"/>
+        </w:rPr>
+        <w:t xml:space="preserve">improve email filtering</w:t>
+      </w:r>
+    </w:p>
+    <w:p>
+      <w:pPr>
+        <w:shd w:fill="ffffff" w:val="clear"/>
+        <w:spacing w:line="240" w:lineRule="auto"/>
+        <w:rPr>
+          <w:color w:val="38556a"/>
+          <w:sz w:val="16"/>
+          <w:szCs w:val="16"/>
+        </w:rPr>
+      </w:pPr>
+      <w:r>
+        <w:rPr>
+          <w:rtl w:val="0"/>
+        </w:rPr>
+      </w:r>
+    </w:p>
+    <w:p>
+      <w:pPr>
+        <w:shd w:fill="ffffff" w:val="clear"/>
+        <w:spacing w:line="240" w:lineRule="auto"/>
+        <w:rPr>
+          <w:color w:val="38556a"/>
+          <w:sz w:val="21"/>
+          <w:szCs w:val="21"/>
+        </w:rPr>
+      </w:pPr>
+      <w:r>
+        <w:rPr>
+          <w:rtl w:val="0"/>
+        </w:rPr>
+      </w:r>
+    </w:p>
+    <w:p>
+      <w:pPr>
+        <w:shd w:fill="ffffff" w:val="clear"/>
+        <w:spacing w:line="240" w:lineRule="auto"/>
+        <w:rPr>
+          <w:color w:val="38556a"/>
+          <w:sz w:val="16"/>
+          <w:szCs w:val="16"/>
+        </w:rPr>
+      </w:pPr>
+      <w:r>
+        <w:rPr>
+          <w:color w:val="38556a"/>
+          <w:sz w:val="16"/>
+          <w:szCs w:val="16"/>
+          <w:rtl w:val="0"/>
+        </w:rPr>
+        <w:t xml:space="preserve">4</w:t>
+      </w:r>
+    </w:p>
+    <w:p>
+      <w:pPr>
+        <w:shd w:fill="ffffff" w:val="clear"/>
+        <w:spacing w:line="240" w:lineRule="auto"/>
+        <w:rPr>
+          <w:color w:val="38556a"/>
+          <w:sz w:val="18"/>
+          <w:szCs w:val="18"/>
+        </w:rPr>
+      </w:pPr>
+      <w:r>
+        <w:rPr>
+          <w:color w:val="38556a"/>
+          <w:sz w:val="18"/>
+          <w:szCs w:val="18"/>
+          <w:rtl w:val="0"/>
+        </w:rPr>
+        <w:t xml:space="preserve">Short-Term Improvements</w:t>
+      </w:r>
+    </w:p>
+    <w:p>
+      <w:pPr>
+        <w:shd w:fill="ffffff" w:val="clear"/>
+        <w:spacing w:line="240" w:lineRule="auto"/>
+        <w:rPr>
+          <w:color w:val="38556a"/>
+          <w:sz w:val="21"/>
+          <w:szCs w:val="21"/>
+        </w:rPr>
+      </w:pPr>
+      <w:r>
+        <w:rPr>
+          <w:rtl w:val="0"/>
+        </w:rPr>
+      </w:r>
+    </w:p>
+    <w:p>
+      <w:pPr>
+        <w:shd w:fill="ffffff" w:val="clear"/>
+        <w:spacing w:line="240" w:lineRule="auto"/>
+        <w:rPr>
+          <w:color w:val="38556a"/>
+          <w:sz w:val="16"/>
+          <w:szCs w:val="16"/>
+        </w:rPr>
+      </w:pPr>
+      <w:r>
+        <w:rPr>
+          <w:color w:val="38556a"/>
+          <w:sz w:val="16"/>
+          <w:szCs w:val="16"/>
+          <w:rtl w:val="0"/>
+        </w:rPr>
+        <w:t xml:space="preserve">Examples:</w:t>
+      </w:r>
+    </w:p>
+    <w:p>
+      <w:pPr>
+        <w:shd w:fill="ffffff" w:val="clear"/>
+        <w:spacing w:line="240" w:lineRule="auto"/>
+        <w:rPr>
+          <w:color w:val="38556a"/>
+          <w:sz w:val="21"/>
+          <w:szCs w:val="21"/>
+        </w:rPr>
+      </w:pPr>
+      <w:r>
+        <w:rPr>
+          <w:rtl w:val="0"/>
+        </w:rPr>
+      </w:r>
+    </w:p>
+    <w:p>
+      <w:pPr>
+        <w:shd w:fill="ffffff" w:val="clear"/>
+        <w:spacing w:line="240" w:lineRule="auto"/>
+        <w:rPr>
+          <w:color w:val="38556a"/>
+          <w:sz w:val="16"/>
+          <w:szCs w:val="16"/>
+        </w:rPr>
+      </w:pPr>
+      <w:r>
+        <w:rPr>
+          <w:color w:val="38556a"/>
+          <w:sz w:val="16"/>
+          <w:szCs w:val="16"/>
+          <w:rtl w:val="0"/>
+        </w:rPr>
+        <w:t xml:space="preserve">improve logging</w:t>
+      </w:r>
+    </w:p>
+    <w:p>
+      <w:pPr>
+        <w:shd w:fill="ffffff" w:val="clear"/>
+        <w:spacing w:line="240" w:lineRule="auto"/>
+        <w:rPr>
+          <w:color w:val="38556a"/>
+          <w:sz w:val="21"/>
+          <w:szCs w:val="21"/>
+        </w:rPr>
+      </w:pPr>
+      <w:r>
+        <w:rPr>
+          <w:rtl w:val="0"/>
+        </w:rPr>
+      </w:r>
+    </w:p>
+    <w:p>
+      <w:pPr>
+        <w:shd w:fill="ffffff" w:val="clear"/>
+        <w:spacing w:line="240" w:lineRule="auto"/>
+        <w:rPr>
+          <w:color w:val="38556a"/>
+          <w:sz w:val="16"/>
+          <w:szCs w:val="16"/>
+        </w:rPr>
+      </w:pPr>
+      <w:r>
+        <w:rPr>
+          <w:color w:val="38556a"/>
+          <w:sz w:val="16"/>
+          <w:szCs w:val="16"/>
+          <w:rtl w:val="0"/>
+        </w:rPr>
+        <w:t xml:space="preserve">deploy endpoint monitoring</w:t>
+      </w:r>
+    </w:p>
+    <w:p>
+      <w:pPr>
+        <w:shd w:fill="ffffff" w:val="clear"/>
+        <w:spacing w:line="240" w:lineRule="auto"/>
+        <w:rPr>
+          <w:color w:val="38556a"/>
+          <w:sz w:val="21"/>
+          <w:szCs w:val="21"/>
+        </w:rPr>
+      </w:pPr>
+      <w:r>
+        <w:rPr>
+          <w:rtl w:val="0"/>
+        </w:rPr>
+      </w:r>
+    </w:p>
+    <w:p>
+      <w:pPr>
+        <w:shd w:fill="ffffff" w:val="clear"/>
+        <w:spacing w:line="240" w:lineRule="auto"/>
+        <w:rPr>
+          <w:color w:val="38556a"/>
+          <w:sz w:val="18"/>
+          <w:szCs w:val="18"/>
+        </w:rPr>
+      </w:pPr>
+      <w:r>
+        <w:rPr>
+          <w:color w:val="38556a"/>
+          <w:sz w:val="18"/>
+          <w:szCs w:val="18"/>
+          <w:rtl w:val="0"/>
+        </w:rPr>
+        <w:t xml:space="preserve">Long-Term Improvements</w:t>
+      </w:r>
+    </w:p>
+    <w:p>
+      <w:pPr>
+        <w:shd w:fill="ffffff" w:val="clear"/>
+        <w:spacing w:line="240" w:lineRule="auto"/>
+        <w:rPr>
+          <w:color w:val="38556a"/>
+          <w:sz w:val="21"/>
+          <w:szCs w:val="21"/>
+        </w:rPr>
+      </w:pPr>
+      <w:r>
+        <w:rPr>
+          <w:rtl w:val="0"/>
+        </w:rPr>
+      </w:r>
+    </w:p>
+    <w:p>
+      <w:pPr>
+        <w:shd w:fill="ffffff" w:val="clear"/>
+        <w:spacing w:line="240" w:lineRule="auto"/>
+        <w:rPr>
+          <w:color w:val="38556a"/>
+          <w:sz w:val="16"/>
+          <w:szCs w:val="16"/>
+        </w:rPr>
+      </w:pPr>
+      <w:r>
+        <w:rPr>
+          <w:color w:val="38556a"/>
+          <w:sz w:val="16"/>
+          <w:szCs w:val="16"/>
+          <w:rtl w:val="0"/>
+        </w:rPr>
+        <w:t xml:space="preserve">Examples:</w:t>
+      </w:r>
+    </w:p>
+    <w:p>
+      <w:pPr>
+        <w:shd w:fill="ffffff" w:val="clear"/>
+        <w:spacing w:line="240" w:lineRule="auto"/>
+        <w:rPr>
+          <w:color w:val="38556a"/>
+          <w:sz w:val="21"/>
+          <w:szCs w:val="21"/>
+        </w:rPr>
+      </w:pPr>
+      <w:r>
+        <w:rPr>
+          <w:rtl w:val="0"/>
+        </w:rPr>
+      </w:r>
+    </w:p>
+    <w:p>
+      <w:pPr>
+        <w:shd w:fill="ffffff" w:val="clear"/>
+        <w:spacing w:line="240" w:lineRule="auto"/>
+        <w:rPr>
+          <w:color w:val="38556a"/>
+          <w:sz w:val="16"/>
+          <w:szCs w:val="16"/>
+        </w:rPr>
+      </w:pPr>
+      <w:r>
+        <w:rPr>
+          <w:color w:val="38556a"/>
+          <w:sz w:val="16"/>
+          <w:szCs w:val="16"/>
+          <w:rtl w:val="0"/>
+        </w:rPr>
+        <w:t xml:space="preserve">user awareness training</w:t>
+      </w:r>
+    </w:p>
+    <w:p>
+      <w:pPr>
+        <w:shd w:fill="ffffff" w:val="clear"/>
+        <w:spacing w:line="240" w:lineRule="auto"/>
+        <w:rPr>
+          <w:color w:val="38556a"/>
+          <w:sz w:val="21"/>
+          <w:szCs w:val="21"/>
+        </w:rPr>
+      </w:pPr>
+      <w:r>
+        <w:rPr>
+          <w:rtl w:val="0"/>
+        </w:rPr>
+      </w:r>
+    </w:p>
+    <w:p>
+      <w:pPr>
+        <w:shd w:fill="ffffff" w:val="clear"/>
+        <w:spacing w:line="240" w:lineRule="auto"/>
+        <w:rPr>
+          <w:color w:val="38556a"/>
+          <w:sz w:val="16"/>
+          <w:szCs w:val="16"/>
+        </w:rPr>
+      </w:pPr>
+      <w:r>
+        <w:rPr>
+          <w:color w:val="38556a"/>
+          <w:sz w:val="16"/>
+          <w:szCs w:val="16"/>
+          <w:rtl w:val="0"/>
+        </w:rPr>
+        <w:t xml:space="preserve">enhanced detection tooling</w:t>
+      </w:r>
+    </w:p>
+    <w:p>
+      <w:pPr>
+        <w:shd w:fill="ffffff" w:val="clear"/>
+        <w:spacing w:line="240" w:lineRule="auto"/>
+        <w:rPr>
+          <w:color w:val="38556a"/>
+          <w:sz w:val="21"/>
+          <w:szCs w:val="21"/>
+        </w:rPr>
+      </w:pPr>
+      <w:r>
+        <w:rPr>
+          <w:rtl w:val="0"/>
+        </w:rPr>
+      </w:r>
+    </w:p>
+    <w:p>
+      <w:pPr>
+        <w:shd w:fill="ffffff" w:val="clear"/>
+        <w:spacing w:line="240" w:lineRule="auto"/>
+        <w:rPr>
+          <w:color w:val="38556a"/>
+          <w:sz w:val="24"/>
+          <w:szCs w:val="24"/>
+        </w:rPr>
+      </w:pPr>
+      <w:r>
+        <w:rPr>
+          <w:color w:val="38556a"/>
+          <w:sz w:val="24"/>
+          <w:szCs w:val="24"/>
+          <w:rtl w:val="0"/>
+        </w:rPr>
+        <w:t xml:space="preserve">🔹</w:t>
+      </w:r>
+    </w:p>
+    <w:p>
+      <w:pPr>
+        <w:shd w:fill="ffffff" w:val="clear"/>
+        <w:spacing w:line="240" w:lineRule="auto"/>
+        <w:rPr>
+          <w:color w:val="38556a"/>
+          <w:sz w:val="24"/>
+          <w:szCs w:val="24"/>
+        </w:rPr>
+      </w:pPr>
+      <w:r>
+        <w:rPr>
+          <w:color w:val="38556a"/>
+          <w:sz w:val="24"/>
+          <w:szCs w:val="24"/>
+          <w:rtl w:val="0"/>
+        </w:rPr>
+        <w:t xml:space="preserve">9. Reflection</w:t>
+      </w:r>
+    </w:p>
+    <w:p>
+      <w:pPr>
+        <w:shd w:fill="ffffff" w:val="clear"/>
+        <w:spacing w:line="240" w:lineRule="auto"/>
+        <w:rPr>
+          <w:color w:val="38556a"/>
+          <w:sz w:val="21"/>
+          <w:szCs w:val="21"/>
+        </w:rPr>
+      </w:pPr>
+      <w:r>
+        <w:rPr>
+          <w:rtl w:val="0"/>
+        </w:rPr>
+      </w:r>
+    </w:p>
+    <w:p>
+      <w:pPr>
+        <w:shd w:fill="ffffff" w:val="clear"/>
+        <w:spacing w:line="240" w:lineRule="auto"/>
+        <w:rPr>
+          <w:color w:val="38556a"/>
+          <w:sz w:val="16"/>
+          <w:szCs w:val="16"/>
+        </w:rPr>
+      </w:pPr>
+      <w:r>
+        <w:rPr>
+          <w:color w:val="38556a"/>
+          <w:sz w:val="16"/>
+          <w:szCs w:val="16"/>
+          <w:rtl w:val="0"/>
+        </w:rPr>
+        <w:t xml:space="preserve">Explain:</w:t>
+      </w:r>
+    </w:p>
+    <w:p>
+      <w:pPr>
+        <w:shd w:fill="ffffff" w:val="clear"/>
+        <w:spacing w:line="240" w:lineRule="auto"/>
+        <w:rPr>
+          <w:color w:val="38556a"/>
+          <w:sz w:val="21"/>
+          <w:szCs w:val="21"/>
+        </w:rPr>
+      </w:pPr>
+      <w:r>
+        <w:rPr>
+          <w:rtl w:val="0"/>
+        </w:rPr>
+      </w:r>
+    </w:p>
+    <w:p>
+      <w:pPr>
+        <w:shd w:fill="ffffff" w:val="clear"/>
+        <w:spacing w:line="240" w:lineRule="auto"/>
+        <w:rPr>
+          <w:color w:val="38556a"/>
+          <w:sz w:val="16"/>
+          <w:szCs w:val="16"/>
+        </w:rPr>
+      </w:pPr>
+      <w:r>
+        <w:rPr>
+          <w:color w:val="38556a"/>
+          <w:sz w:val="16"/>
+          <w:szCs w:val="16"/>
+          <w:rtl w:val="0"/>
+        </w:rPr>
+        <w:t xml:space="preserve">what was challenging</w:t>
+      </w:r>
+    </w:p>
+    <w:p>
+      <w:pPr>
+        <w:shd w:fill="ffffff" w:val="clear"/>
+        <w:spacing w:line="240" w:lineRule="auto"/>
+        <w:rPr>
+          <w:color w:val="38556a"/>
+          <w:sz w:val="21"/>
+          <w:szCs w:val="21"/>
+        </w:rPr>
+      </w:pPr>
+      <w:r>
+        <w:rPr>
+          <w:rtl w:val="0"/>
+        </w:rPr>
+      </w:r>
+    </w:p>
+    <w:p>
+      <w:pPr>
+        <w:shd w:fill="ffffff" w:val="clear"/>
+        <w:spacing w:line="240" w:lineRule="auto"/>
+        <w:rPr>
+          <w:color w:val="38556a"/>
+          <w:sz w:val="16"/>
+          <w:szCs w:val="16"/>
+        </w:rPr>
+      </w:pPr>
+      <w:r>
+        <w:rPr>
+          <w:color w:val="38556a"/>
+          <w:sz w:val="16"/>
+          <w:szCs w:val="16"/>
+          <w:rtl w:val="0"/>
+        </w:rPr>
+        <w:t xml:space="preserve">what you learned about detection design</w:t>
+      </w:r>
+    </w:p>
+    <w:p>
+      <w:pPr>
+        <w:shd w:fill="ffffff" w:val="clear"/>
+        <w:spacing w:line="240" w:lineRule="auto"/>
+        <w:rPr>
+          <w:color w:val="38556a"/>
+          <w:sz w:val="21"/>
+          <w:szCs w:val="21"/>
+        </w:rPr>
+      </w:pPr>
+      <w:r>
+        <w:rPr>
+          <w:rtl w:val="0"/>
+        </w:rPr>
+      </w:r>
+    </w:p>
+    <w:p>
+      <w:pPr>
+        <w:shd w:fill="ffffff" w:val="clear"/>
+        <w:spacing w:line="240" w:lineRule="auto"/>
+        <w:rPr>
+          <w:color w:val="38556a"/>
+          <w:sz w:val="16"/>
+          <w:szCs w:val="16"/>
+        </w:rPr>
+      </w:pPr>
+      <w:r>
+        <w:rPr>
+          <w:color w:val="38556a"/>
+          <w:sz w:val="16"/>
+          <w:szCs w:val="16"/>
+          <w:rtl w:val="0"/>
+        </w:rPr>
+        <w:t xml:space="preserve">what you would improve</w:t>
+      </w:r>
+    </w:p>
+    <w:p>
+      <w:pPr>
+        <w:rPr>
+          <w:b w:val="1"/>
+          <w:bCs w:val="1"/>
+          <w:sz w:val="36"/>
+          <w:szCs w:val="36"/>
+        </w:rPr>
+      </w:pPr>
+      <w:r>
+        <w:rPr>
+          <w:rtl w:val="0"/>
+        </w:rPr>
+      </w:r>
+    </w:p>
+    <w:p>
+      <w:pPr>
+        <w:rPr>
+          <w:b w:val="1"/>
+          <w:bCs w:val="1"/>
+          <w:sz w:val="36"/>
+          <w:szCs w:val="36"/>
+        </w:rPr>
+      </w:pPr>
+      <w:r>
+        <w:rPr>
+          <w:rtl w:val="0"/>
+        </w:rPr>
+      </w:r>
+    </w:p>
+    <w:p>
+      <w:pPr>
+        <w:rPr>
+          <w:b w:val="1"/>
+          <w:bCs w:val="1"/>
+          <w:sz w:val="36"/>
+          <w:szCs w:val="36"/>
+        </w:rPr>
+      </w:pPr>
+      <w:r>
+        <w:rPr>
+          <w:rtl w:val="0"/>
+        </w:rPr>
+      </w:r>
+    </w:p>
+    <w:p>
+      <w:pPr>
+        <w:rPr/>
+      </w:pPr>
+      <w:r>
+        <w:rPr>
+          <w:rtl w:val="0"/>
+        </w:rPr>
+        <w:t xml:space="preserve">, </w:t>
+      </w:r>
+    </w:p>
+    <w:p>
+      <w:pPr>
+        <w:rPr/>
+      </w:pPr>
+      <w:r>
+        <w:rPr>
+          <w:rtl w:val="0"/>
+        </w:rPr>
+      </w:r>
+    </w:p>
+    <w:p>
+      <w:pPr>
+        <w:rPr/>
+      </w:pPr>
+      <w:r>
+        <w:rPr>
+          <w:rtl w:val="0"/>
+        </w:rPr>
+      </w:r>
+    </w:p>
+    <w:p>
+      <w:pPr>
+        <w:rPr/>
+      </w:pPr>
+      <w:r>
+        <w:rPr>
+          <w:rtl w:val="0"/>
+        </w:rPr>
+      </w:r>
+    </w:p>
+    <w:p>
+      <w:pPr>
+        <w:rPr/>
+      </w:pPr>
+      <w:r>
+        <w:rPr>
+          <w:rtl w:val="0"/>
+        </w:rPr>
+      </w:r>
+    </w:p>
+    <w:p>
+      <w:pPr>
+        <w:rPr/>
+      </w:pPr>
+      <w:r>
+        <w:rPr>
+          <w:rtl w:val="0"/>
+        </w:rPr>
       </w:r>
     </w:p>
     <w:p>
@@ -1228,7 +2932,7 @@
     </w:p>
     <w:sectPr>
       <w:pgSz w:h="15840" w:w="12240" w:orient="portrait"/>
-      <w:pgMar w:bottom="1440" w:top="1440" w:left="1440" w:right="1440" w:header="720" w:footer="720"/>
+      <w:pgMar w:bottom="1440" w:top="1440" w:left="1440" w:right="1350" w:header="720" w:footer="720"/>
       <w:pgNumType w:start="1"/>
     </w:sectPr>
   </w:body>
@@ -1236,7 +2940,121 @@
 </file>
 
 <file path=word/numbering.xml><?xml version="1.0" encoding="utf-8"?>
-<w:numbering xmlns:mc="http://schemas.openxmlformats.org/markup-compatibility/2006" xmlns:o="urn:schemas-microsoft-com:office:office" xmlns:r="http://schemas.openxmlformats.org/officeDocument/2006/relationships" xmlns:m="http://schemas.openxmlformats.org/officeDocument/2006/math" xmlns:v="urn:schemas-microsoft-com:vml" xmlns:wp="http://schemas.openxmlformats.org/drawingml/2006/wordprocessingDrawing" xmlns:w10="urn:schemas-microsoft-com:office:word" xmlns:w="http://schemas.openxmlformats.org/wordprocessingml/2006/main" xmlns:wne="http://schemas.microsoft.com/office/word/2006/wordml" xmlns:sl="http://schemas.openxmlformats.org/schemaLibrary/2006/main" xmlns:a="http://schemas.openxmlformats.org/drawingml/2006/main" xmlns:pic="http://schemas.openxmlformats.org/drawingml/2006/picture" xmlns:c="http://schemas.openxmlformats.org/drawingml/2006/chart" xmlns:lc="http://schemas.openxmlformats.org/drawingml/2006/lockedCanvas" xmlns:dgm="http://schemas.openxmlformats.org/drawingml/2006/diagram" xmlns:wps="http://schemas.microsoft.com/office/word/2010/wordprocessingShape" xmlns:wpg="http://schemas.microsoft.com/office/word/2010/wordprocessingGroup" xmlns:w14="http://schemas.microsoft.com/office/word/2010/wordml" xmlns:w15="http://schemas.microsoft.com/office/word/2012/wordml" xmlns:w16="http://schemas.microsoft.com/office/word/2018/wordml" xmlns:w16cex="http://schemas.microsoft.com/office/word/2018/wordml/cex" xmlns:w16cid="http://schemas.microsoft.com/office/word/2016/wordml/cid" xmlns="http://schemas.microsoft.com/office/tasks/2019/documenttasks" xmlns:cr="http://schemas.microsoft.com/office/comments/2020/reactions"/>
+<w:numbering xmlns:mc="http://schemas.openxmlformats.org/markup-compatibility/2006" xmlns:o="urn:schemas-microsoft-com:office:office" xmlns:r="http://schemas.openxmlformats.org/officeDocument/2006/relationships" xmlns:m="http://schemas.openxmlformats.org/officeDocument/2006/math" xmlns:v="urn:schemas-microsoft-com:vml" xmlns:wp="http://schemas.openxmlformats.org/drawingml/2006/wordprocessingDrawing" xmlns:w10="urn:schemas-microsoft-com:office:word" xmlns:w="http://schemas.openxmlformats.org/wordprocessingml/2006/main" xmlns:wne="http://schemas.microsoft.com/office/word/2006/wordml" xmlns:sl="http://schemas.openxmlformats.org/schemaLibrary/2006/main" xmlns:a="http://schemas.openxmlformats.org/drawingml/2006/main" xmlns:pic="http://schemas.openxmlformats.org/drawingml/2006/picture" xmlns:c="http://schemas.openxmlformats.org/drawingml/2006/chart" xmlns:lc="http://schemas.openxmlformats.org/drawingml/2006/lockedCanvas" xmlns:dgm="http://schemas.openxmlformats.org/drawingml/2006/diagram" xmlns:wps="http://schemas.microsoft.com/office/word/2010/wordprocessingShape" xmlns:wpg="http://schemas.microsoft.com/office/word/2010/wordprocessingGroup" xmlns:w14="http://schemas.microsoft.com/office/word/2010/wordml" xmlns:w15="http://schemas.microsoft.com/office/word/2012/wordml" xmlns:w16="http://schemas.microsoft.com/office/word/2018/wordml" xmlns:w16cex="http://schemas.microsoft.com/office/word/2018/wordml/cex" xmlns:w16cid="http://schemas.microsoft.com/office/word/2016/wordml/cid" xmlns="http://schemas.microsoft.com/office/tasks/2019/documenttasks" xmlns:cr="http://schemas.microsoft.com/office/comments/2020/reactions">
+  <w:abstractNum w:abstractNumId="1">
+    <w:lvl w:ilvl="0">
+      <w:start w:val="1"/>
+      <w:numFmt w:val="bullet"/>
+      <w:lvlText w:val="●"/>
+      <w:lvlJc w:val="left"/>
+      <w:pPr>
+        <w:ind w:left="720" w:hanging="360"/>
+      </w:pPr>
+      <w:rPr>
+        <w:u w:val="none"/>
+      </w:rPr>
+    </w:lvl>
+    <w:lvl w:ilvl="1">
+      <w:start w:val="1"/>
+      <w:numFmt w:val="bullet"/>
+      <w:lvlText w:val="○"/>
+      <w:lvlJc w:val="left"/>
+      <w:pPr>
+        <w:ind w:left="1440" w:hanging="360"/>
+      </w:pPr>
+      <w:rPr>
+        <w:u w:val="none"/>
+      </w:rPr>
+    </w:lvl>
+    <w:lvl w:ilvl="2">
+      <w:start w:val="1"/>
+      <w:numFmt w:val="bullet"/>
+      <w:lvlText w:val="■"/>
+      <w:lvlJc w:val="left"/>
+      <w:pPr>
+        <w:ind w:left="2160" w:hanging="360"/>
+      </w:pPr>
+      <w:rPr>
+        <w:u w:val="none"/>
+      </w:rPr>
+    </w:lvl>
+    <w:lvl w:ilvl="3">
+      <w:start w:val="1"/>
+      <w:numFmt w:val="bullet"/>
+      <w:lvlText w:val="●"/>
+      <w:lvlJc w:val="left"/>
+      <w:pPr>
+        <w:ind w:left="2880" w:hanging="360"/>
+      </w:pPr>
+      <w:rPr>
+        <w:u w:val="none"/>
+      </w:rPr>
+    </w:lvl>
+    <w:lvl w:ilvl="4">
+      <w:start w:val="1"/>
+      <w:numFmt w:val="bullet"/>
+      <w:lvlText w:val="○"/>
+      <w:lvlJc w:val="left"/>
+      <w:pPr>
+        <w:ind w:left="3600" w:hanging="360"/>
+      </w:pPr>
+      <w:rPr>
+        <w:u w:val="none"/>
+      </w:rPr>
+    </w:lvl>
+    <w:lvl w:ilvl="5">
+      <w:start w:val="1"/>
+      <w:numFmt w:val="bullet"/>
+      <w:lvlText w:val="■"/>
+      <w:lvlJc w:val="left"/>
+      <w:pPr>
+        <w:ind w:left="4320" w:hanging="360"/>
+      </w:pPr>
+      <w:rPr>
+        <w:u w:val="none"/>
+      </w:rPr>
+    </w:lvl>
+    <w:lvl w:ilvl="6">
+      <w:start w:val="1"/>
+      <w:numFmt w:val="bullet"/>
+      <w:lvlText w:val="●"/>
+      <w:lvlJc w:val="left"/>
+      <w:pPr>
+        <w:ind w:left="5040" w:hanging="360"/>
+      </w:pPr>
+      <w:rPr>
+        <w:u w:val="none"/>
+      </w:rPr>
+    </w:lvl>
+    <w:lvl w:ilvl="7">
+      <w:start w:val="1"/>
+      <w:numFmt w:val="bullet"/>
+      <w:lvlText w:val="○"/>
+      <w:lvlJc w:val="left"/>
+      <w:pPr>
+        <w:ind w:left="5760" w:hanging="360"/>
+      </w:pPr>
+      <w:rPr>
+        <w:u w:val="none"/>
+      </w:rPr>
+    </w:lvl>
+    <w:lvl w:ilvl="8">
+      <w:start w:val="1"/>
+      <w:numFmt w:val="bullet"/>
+      <w:lvlText w:val="■"/>
+      <w:lvlJc w:val="left"/>
+      <w:pPr>
+        <w:ind w:left="6480" w:hanging="360"/>
+      </w:pPr>
+      <w:rPr>
+        <w:u w:val="none"/>
+      </w:rPr>
+    </w:lvl>
+  </w:abstractNum>
+  <w:num w:numId="1">
+    <w:abstractNumId w:val="1"/>
+  </w:num>
+</w:numbering>
 </file>
 
 <file path=word/styles.xml><?xml version="1.0" encoding="utf-8"?>

</xml_diff>